<commit_message>
Re-sign Ethio Telecom cover letter for in-country submission
The letter is submitted in person in Addis Ababa, so the signature
block now names Moti Begi, Operations Officer, signing for and on
behalf of DAPS PLC.
</commit_message>
<xml_diff>
--- a/docs/business/DAPS_Ethio_Telecom_Cover_Letter.docx
+++ b/docs/business/DAPS_Ethio_Telecom_Cover_Letter.docx
@@ -973,7 +973,7 @@
           <w:sz w:val="22"/>
           <w:szCs w:val="22"/>
         </w:rPr>
-        <w:t xml:space="preserve">Oli Tamrat Oli</w:t>
+        <w:t xml:space="preserve">Moti Begi</w:t>
       </w:r>
     </w:p>
     <w:p>
@@ -992,7 +992,7 @@
           <w:sz w:val="20"/>
           <w:szCs w:val="20"/>
         </w:rPr>
-        <w:t xml:space="preserve">Founder &amp; Chief Executive Officer</w:t>
+        <w:t xml:space="preserve">Operations Officer</w:t>
       </w:r>
     </w:p>
     <w:p>
@@ -1011,7 +1011,7 @@
           <w:sz w:val="20"/>
           <w:szCs w:val="20"/>
         </w:rPr>
-        <w:t xml:space="preserve">DAPS PLC</w:t>
+        <w:t xml:space="preserve">For and on behalf of DAPS PLC</w:t>
       </w:r>
     </w:p>
     <w:p>

</xml_diff>